<commit_message>
Actualización del archivo PARCIAL 2 ORACLE SQL DEVELOPER
</commit_message>
<xml_diff>
--- a/PARCIAL 2 ORACLE SQL DEVELOPER.docx
+++ b/PARCIAL 2 ORACLE SQL DEVELOPER.docx
@@ -1516,12 +1516,14 @@
         <w:rPr>
           <w:sz w:val="24"/>
           <w:szCs w:val="24"/>
-        </w:rPr>
-      </w:pPr>
-      <w:r>
-        <w:rPr>
-          <w:sz w:val="24"/>
-          <w:szCs w:val="24"/>
+          <w:lang w:val="en-US"/>
+        </w:rPr>
+      </w:pPr>
+      <w:r>
+        <w:rPr>
+          <w:sz w:val="24"/>
+          <w:szCs w:val="24"/>
+          <w:lang w:val="en-US"/>
         </w:rPr>
         <w:t>____________________________________</w:t>
       </w:r>
@@ -15443,6 +15445,20 @@
           <w:szCs w:val="24"/>
         </w:rPr>
       </w:pPr>
+      <w:r>
+        <w:rPr>
+          <w:sz w:val="24"/>
+          <w:szCs w:val="24"/>
+        </w:rPr>
+        <w:t xml:space="preserve">VIDEO: </w:t>
+      </w:r>
+      <w:r>
+        <w:rPr>
+          <w:sz w:val="24"/>
+          <w:szCs w:val="24"/>
+        </w:rPr>
+        <w:t>https://youtu.be/kmG3q5i4aRY</w:t>
+      </w:r>
     </w:p>
     <w:sectPr>
       <w:pgSz w:w="12240" w:h="15840"/>

</xml_diff>